<commit_message>
*Correcciones de color de fondo, titulos y colores
</commit_message>
<xml_diff>
--- a/plantillas/plantilla10/5.ENTREGABLE.docx
+++ b/plantillas/plantilla10/5.ENTREGABLE.docx
@@ -17,10 +17,10 @@
         <mc:AlternateContent>
           <mc:Choice Requires="wps">
             <w:drawing>
-              <wp:anchor distT="45720" distB="45720" distL="114300" distR="114300" simplePos="0" relativeHeight="251678720" behindDoc="0" locked="0" layoutInCell="1" hidden="0" allowOverlap="1" wp14:anchorId="13A6AEDC" wp14:editId="4CD43E9B">
+              <wp:anchor distT="45720" distB="45720" distL="114300" distR="114300" simplePos="0" relativeHeight="251678720" behindDoc="0" locked="0" layoutInCell="1" hidden="0" allowOverlap="1" wp14:anchorId="13A6AEDC" wp14:editId="21936887">
                 <wp:simplePos x="0" y="0"/>
                 <wp:positionH relativeFrom="margin">
-                  <wp:posOffset>-1020445</wp:posOffset>
+                  <wp:align>center</wp:align>
                 </wp:positionH>
                 <wp:positionV relativeFrom="paragraph">
                   <wp:posOffset>334645</wp:posOffset>
@@ -51,28 +51,40 @@
                         <w:txbxContent>
                           <w:p>
                             <w:pPr>
-                              <w:spacing w:after="0" w:line="240" w:lineRule="auto"/>
                               <w:jc w:val="center"/>
-                              <w:textDirection w:val="btLr"/>
                               <w:rPr>
-                                <w:rFonts w:ascii="Arial" w:eastAsia="Arial" w:hAnsi="Arial" w:cs="Arial"/>
                                 <w:b/>
                                 <w:bCs/>
-                                <w:color w:val="C45911" w:themeColor="accent2" w:themeShade="BF"/>
-                                <w:sz w:val="72"/>
-                                <w:szCs w:val="72"/>
+                                <w:sz w:val="44"/>
+                                <w:szCs w:val="44"/>
                               </w:rPr>
                             </w:pPr>
                             <w:r>
                               <w:rPr>
-                                <w:rFonts w:eastAsia="Arial" w:cs="Arial"/>
                                 <w:b/>
                                 <w:bCs/>
-                                <w:color w:val="C45911" w:themeColor="accent2" w:themeShade="BF"/>
-                                <w:sz w:val="72"/>
-                                <w:szCs w:val="72"/>
+                                <w:sz w:val="44"/>
+                                <w:szCs w:val="44"/>
                               </w:rPr>
-                              <w:t>{{EMPRESA_BRINDA}}</w:t>
+                              <w:t>{{EMPRESA_BRINDA</w:t>
+                            </w:r>
+                            <w:r>
+                              <w:rPr>
+                                <w:b/>
+                                <w:bCs/>
+                                <w:sz w:val="44"/>
+                                <w:szCs w:val="44"/>
+                              </w:rPr>
+                              <w:t>_PORTADA</w:t>
+                            </w:r>
+                            <w:r>
+                              <w:rPr>
+                                <w:b/>
+                                <w:bCs/>
+                                <w:sz w:val="44"/>
+                                <w:szCs w:val="44"/>
+                              </w:rPr>
+                              <w:t>}}</w:t>
                             </w:r>
                           </w:p>
                         </w:txbxContent>
@@ -94,33 +106,45 @@
           </mc:Choice>
           <mc:Fallback>
             <w:pict>
-              <v:rect w14:anchorId="13A6AEDC" id="Rectángulo 14" o:spid="_x0000_s1026" style="position:absolute;left:0;text-align:left;margin-left:-80.35pt;margin-top:26.35pt;width:576.6pt;height:63.05pt;z-index:251678720;visibility:visible;mso-wrap-style:square;mso-width-percent:0;mso-height-percent:0;mso-wrap-distance-left:9pt;mso-wrap-distance-top:3.6pt;mso-wrap-distance-right:9pt;mso-wrap-distance-bottom:3.6pt;mso-position-horizontal:absolute;mso-position-horizontal-relative:margin;mso-position-vertical:absolute;mso-position-vertical-relative:text;mso-width-percent:0;mso-height-percent:0;mso-width-relative:margin;mso-height-relative:margin;v-text-anchor:middle" o:gfxdata="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" filled="f" stroked="f">
+              <v:rect w14:anchorId="13A6AEDC" id="Rectángulo 14" o:spid="_x0000_s1026" style="position:absolute;left:0;text-align:left;margin-left:0;margin-top:26.35pt;width:576.6pt;height:63.05pt;z-index:251678720;visibility:visible;mso-wrap-style:square;mso-width-percent:0;mso-height-percent:0;mso-wrap-distance-left:9pt;mso-wrap-distance-top:3.6pt;mso-wrap-distance-right:9pt;mso-wrap-distance-bottom:3.6pt;mso-position-horizontal:center;mso-position-horizontal-relative:margin;mso-position-vertical:absolute;mso-position-vertical-relative:text;mso-width-percent:0;mso-height-percent:0;mso-width-relative:margin;mso-height-relative:margin;v-text-anchor:middle" o:gfxdata="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" filled="f" stroked="f">
                 <v:textbox inset="2.53958mm,1.2694mm,2.53958mm,1.2694mm">
                   <w:txbxContent>
                     <w:p>
                       <w:pPr>
-                        <w:spacing w:after="0" w:line="240" w:lineRule="auto"/>
                         <w:jc w:val="center"/>
-                        <w:textDirection w:val="btLr"/>
                         <w:rPr>
-                          <w:rFonts w:ascii="Arial" w:eastAsia="Arial" w:hAnsi="Arial" w:cs="Arial"/>
                           <w:b/>
                           <w:bCs/>
-                          <w:color w:val="C45911" w:themeColor="accent2" w:themeShade="BF"/>
-                          <w:sz w:val="72"/>
-                          <w:szCs w:val="72"/>
+                          <w:sz w:val="44"/>
+                          <w:szCs w:val="44"/>
                         </w:rPr>
                       </w:pPr>
                       <w:r>
                         <w:rPr>
-                          <w:rFonts w:eastAsia="Arial" w:cs="Arial"/>
                           <w:b/>
                           <w:bCs/>
-                          <w:color w:val="C45911" w:themeColor="accent2" w:themeShade="BF"/>
-                          <w:sz w:val="72"/>
-                          <w:szCs w:val="72"/>
+                          <w:sz w:val="44"/>
+                          <w:szCs w:val="44"/>
                         </w:rPr>
-                        <w:t>{{EMPRESA_BRINDA}}</w:t>
+                        <w:t>{{EMPRESA_BRINDA</w:t>
+                      </w:r>
+                      <w:r>
+                        <w:rPr>
+                          <w:b/>
+                          <w:bCs/>
+                          <w:sz w:val="44"/>
+                          <w:szCs w:val="44"/>
+                        </w:rPr>
+                        <w:t>_PORTADA</w:t>
+                      </w:r>
+                      <w:r>
+                        <w:rPr>
+                          <w:b/>
+                          <w:bCs/>
+                          <w:sz w:val="44"/>
+                          <w:szCs w:val="44"/>
+                        </w:rPr>
+                        <w:t>}}</w:t>
                       </w:r>
                     </w:p>
                   </w:txbxContent>
@@ -292,13 +316,13 @@
         <mc:AlternateContent>
           <mc:Choice Requires="wps">
             <w:drawing>
-              <wp:anchor distT="45720" distB="45720" distL="114300" distR="114300" simplePos="0" relativeHeight="251674624" behindDoc="0" locked="0" layoutInCell="1" hidden="0" allowOverlap="1" wp14:anchorId="483F8408" wp14:editId="34F599DA">
+              <wp:anchor distT="45720" distB="45720" distL="114300" distR="114300" simplePos="0" relativeHeight="251674624" behindDoc="0" locked="0" layoutInCell="1" hidden="0" allowOverlap="1" wp14:anchorId="483F8408" wp14:editId="4AC54142">
                 <wp:simplePos x="0" y="0"/>
                 <wp:positionH relativeFrom="margin">
-                  <wp:posOffset>-628298</wp:posOffset>
+                  <wp:align>center</wp:align>
                 </wp:positionH>
                 <wp:positionV relativeFrom="paragraph">
-                  <wp:posOffset>429060</wp:posOffset>
+                  <wp:posOffset>337185</wp:posOffset>
                 </wp:positionV>
                 <wp:extent cx="6989445" cy="927735"/>
                 <wp:effectExtent l="0" t="0" r="0" b="5715"/>
@@ -326,25 +350,40 @@
                         <w:txbxContent>
                           <w:p>
                             <w:pPr>
-                              <w:spacing w:after="0"/>
                               <w:jc w:val="center"/>
-                              <w:textDirection w:val="btLr"/>
                               <w:rPr>
                                 <w:b/>
                                 <w:bCs/>
-                                <w:lang w:val="en-US"/>
+                                <w:sz w:val="44"/>
+                                <w:szCs w:val="44"/>
                               </w:rPr>
                             </w:pPr>
                             <w:r>
                               <w:rPr>
-                                <w:rFonts w:eastAsia="Arial" w:cs="Arial"/>
                                 <w:b/>
                                 <w:bCs/>
-                                <w:color w:val="C45911" w:themeColor="accent2" w:themeShade="BF"/>
-                                <w:sz w:val="72"/>
-                                <w:szCs w:val="72"/>
+                                <w:sz w:val="44"/>
+                                <w:szCs w:val="44"/>
                               </w:rPr>
-                              <w:t>{{EMPRESA_RECIBE}}</w:t>
+                              <w:t>{{EMPRESA_RECIBE</w:t>
+                            </w:r>
+                            <w:r>
+                              <w:rPr>
+                                <w:b/>
+                                <w:bCs/>
+                                <w:sz w:val="44"/>
+                                <w:szCs w:val="44"/>
+                              </w:rPr>
+                              <w:t>_PORTADA</w:t>
+                            </w:r>
+                            <w:r>
+                              <w:rPr>
+                                <w:b/>
+                                <w:bCs/>
+                                <w:sz w:val="44"/>
+                                <w:szCs w:val="44"/>
+                              </w:rPr>
+                              <w:t>}}</w:t>
                             </w:r>
                           </w:p>
                         </w:txbxContent>
@@ -366,30 +405,45 @@
           </mc:Choice>
           <mc:Fallback>
             <w:pict>
-              <v:rect w14:anchorId="483F8408" id="Rectángulo 1602697076" o:spid="_x0000_s1028" style="position:absolute;left:0;text-align:left;margin-left:-49.45pt;margin-top:33.8pt;width:550.35pt;height:73.05pt;z-index:251674624;visibility:visible;mso-wrap-style:square;mso-width-percent:0;mso-height-percent:0;mso-wrap-distance-left:9pt;mso-wrap-distance-top:3.6pt;mso-wrap-distance-right:9pt;mso-wrap-distance-bottom:3.6pt;mso-position-horizontal:absolute;mso-position-horizontal-relative:margin;mso-position-vertical:absolute;mso-position-vertical-relative:text;mso-width-percent:0;mso-height-percent:0;mso-width-relative:margin;mso-height-relative:margin;v-text-anchor:middle" o:gfxdata="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" filled="f" stroked="f">
+              <v:rect w14:anchorId="483F8408" id="Rectángulo 1602697076" o:spid="_x0000_s1028" style="position:absolute;left:0;text-align:left;margin-left:0;margin-top:26.55pt;width:550.35pt;height:73.05pt;z-index:251674624;visibility:visible;mso-wrap-style:square;mso-width-percent:0;mso-height-percent:0;mso-wrap-distance-left:9pt;mso-wrap-distance-top:3.6pt;mso-wrap-distance-right:9pt;mso-wrap-distance-bottom:3.6pt;mso-position-horizontal:center;mso-position-horizontal-relative:margin;mso-position-vertical:absolute;mso-position-vertical-relative:text;mso-width-percent:0;mso-height-percent:0;mso-width-relative:margin;mso-height-relative:margin;v-text-anchor:middle" o:gfxdata="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" filled="f" stroked="f">
                 <v:textbox inset="2.53958mm,1.2694mm,2.53958mm,1.2694mm">
                   <w:txbxContent>
                     <w:p>
                       <w:pPr>
-                        <w:spacing w:after="0"/>
                         <w:jc w:val="center"/>
-                        <w:textDirection w:val="btLr"/>
                         <w:rPr>
                           <w:b/>
                           <w:bCs/>
-                          <w:lang w:val="en-US"/>
+                          <w:sz w:val="44"/>
+                          <w:szCs w:val="44"/>
                         </w:rPr>
                       </w:pPr>
                       <w:r>
                         <w:rPr>
-                          <w:rFonts w:eastAsia="Arial" w:cs="Arial"/>
                           <w:b/>
                           <w:bCs/>
-                          <w:color w:val="C45911" w:themeColor="accent2" w:themeShade="BF"/>
-                          <w:sz w:val="72"/>
-                          <w:szCs w:val="72"/>
+                          <w:sz w:val="44"/>
+                          <w:szCs w:val="44"/>
                         </w:rPr>
-                        <w:t>{{EMPRESA_RECIBE}}</w:t>
+                        <w:t>{{EMPRESA_RECIBE</w:t>
+                      </w:r>
+                      <w:r>
+                        <w:rPr>
+                          <w:b/>
+                          <w:bCs/>
+                          <w:sz w:val="44"/>
+                          <w:szCs w:val="44"/>
+                        </w:rPr>
+                        <w:t>_PORTADA</w:t>
+                      </w:r>
+                      <w:r>
+                        <w:rPr>
+                          <w:b/>
+                          <w:bCs/>
+                          <w:sz w:val="44"/>
+                          <w:szCs w:val="44"/>
+                        </w:rPr>
+                        <w:t>}}</w:t>
                       </w:r>
                     </w:p>
                   </w:txbxContent>
@@ -418,6 +472,13 @@
     </w:p>
     <w:sdt>
       <w:sdtPr>
+        <w:rPr>
+          <w:rFonts w:ascii="Californian FB" w:eastAsiaTheme="minorHAnsi" w:hAnsi="Californian FB" w:cstheme="minorBidi"/>
+          <w:color w:val="auto"/>
+          <w:sz w:val="24"/>
+          <w:szCs w:val="22"/>
+          <w:lang w:eastAsia="en-US"/>
+        </w:rPr>
         <w:id w:val="-1433729524"/>
         <w:docPartObj>
           <w:docPartGallery w:val="Table of Contents"/>
@@ -426,22 +487,24 @@
       </w:sdtPr>
       <w:sdtEndPr>
         <w:rPr>
-          <w:rFonts w:ascii="Californian FB" w:eastAsiaTheme="minorHAnsi" w:hAnsi="Californian FB" w:cstheme="minorBidi"/>
           <w:b/>
           <w:bCs/>
-          <w:color w:val="auto"/>
-          <w:sz w:val="24"/>
-          <w:szCs w:val="22"/>
-          <w:lang w:eastAsia="en-US"/>
         </w:rPr>
       </w:sdtEndPr>
       <w:sdtContent>
         <w:p>
           <w:pPr>
             <w:pStyle w:val="TtuloTDC"/>
+            <w:jc w:val="center"/>
           </w:pPr>
           <w:r>
-            <w:t>Contenido</w:t>
+            <w:t>{{T</w:t>
+          </w:r>
+          <w:r>
+            <w:t>ITULO_INDICE</w:t>
+          </w:r>
+          <w:r>
+            <w:t>}}</w:t>
           </w:r>
         </w:p>
         <w:p>
@@ -1035,7 +1098,13 @@
         <w:t xml:space="preserve">El servicio se llevó a cabo en las instalaciones del cliente, durante el periodo comprendido del </w:t>
       </w:r>
       <w:r>
-        <w:t>{{FECHA}}</w:t>
+        <w:t>{{</w:t>
+      </w:r>
+      <w:r>
+        <w:t>FECHA_SERVICIO</w:t>
+      </w:r>
+      <w:r>
+        <w:t>}}</w:t>
       </w:r>
       <w:r>
         <w:t>. Durante su desarrollo, se llevaron a cabo las siguientes actividades:</w:t>
@@ -1054,20 +1123,13 @@
         <w:br w:type="page"/>
       </w:r>
     </w:p>
-    <w:p/>
     <w:p>
       <w:pPr>
         <w:pStyle w:val="Ttulo1"/>
       </w:pPr>
-      <w:bookmarkStart w:id="0" w:name="_Toc228795078"/>
-      <w:bookmarkStart w:id="1" w:name="_Toc230601830"/>
       <w:r>
-        <w:t>INTRODUCCIÓN</w:t>
-      </w:r>
-      <w:bookmarkEnd w:id="0"/>
-      <w:bookmarkEnd w:id="1"/>
-      <w:r>
-        <w:t xml:space="preserve"> </w:t>
+        <w:lastRenderedPageBreak/>
+        <w:t>{{TITULO_INTRODUCCION}}</w:t>
       </w:r>
     </w:p>
     <w:p>
@@ -1091,14 +1153,16 @@
     <w:p>
       <w:pPr>
         <w:pStyle w:val="Ttulo1"/>
-      </w:pPr>
-      <w:bookmarkStart w:id="2" w:name="_Toc228795079"/>
-      <w:bookmarkStart w:id="3" w:name="_Toc230601831"/>
+        <w:rPr>
+          <w:lang w:eastAsia="es-MX"/>
+        </w:rPr>
+      </w:pPr>
       <w:r>
-        <w:t>OBJETIVO GENERAL</w:t>
+        <w:rPr>
+          <w:lang w:eastAsia="es-MX"/>
+        </w:rPr>
+        <w:t>{{TITULO_OBJETIVO_GENERAL}}</w:t>
       </w:r>
-      <w:bookmarkEnd w:id="2"/>
-      <w:bookmarkEnd w:id="3"/>
     </w:p>
     <w:p>
       <w:r>
@@ -1110,15 +1174,18 @@
     </w:p>
     <w:p>
       <w:pPr>
-        <w:pStyle w:val="Ttulo2"/>
-      </w:pPr>
-      <w:bookmarkStart w:id="4" w:name="_Toc228795080"/>
-      <w:bookmarkStart w:id="5" w:name="_Toc230601832"/>
+        <w:rPr>
+          <w:b/>
+          <w:bCs/>
+        </w:rPr>
+      </w:pPr>
       <w:r>
-        <w:t>OBJETIVOS ESPECÍFICOS</w:t>
+        <w:rPr>
+          <w:b/>
+          <w:bCs/>
+        </w:rPr>
+        <w:t>{{TITULO_OBJETIVOS_ESPECIFICOS}}</w:t>
       </w:r>
-      <w:bookmarkEnd w:id="4"/>
-      <w:bookmarkEnd w:id="5"/>
     </w:p>
     <w:p>
       <w:pPr>
@@ -1164,23 +1231,36 @@
     </w:p>
     <w:p>
       <w:pPr>
-        <w:pStyle w:val="Prrafodelista"/>
-      </w:pPr>
+        <w:pStyle w:val="Ttulo1"/>
+        <w:rPr>
+          <w:lang w:eastAsia="es-MX"/>
+        </w:rPr>
+      </w:pPr>
+      <w:r>
+        <w:rPr>
+          <w:lang w:eastAsia="es-MX"/>
+        </w:rPr>
+        <w:lastRenderedPageBreak/>
+        <w:t>{{TITULO_</w:t>
+      </w:r>
+      <w:r>
+        <w:rPr>
+          <w:lang w:eastAsia="es-MX"/>
+        </w:rPr>
+        <w:t>PROGRAMA</w:t>
+      </w:r>
+      <w:r>
+        <w:rPr>
+          <w:lang w:eastAsia="es-MX"/>
+        </w:rPr>
+        <w:t>}}</w:t>
+      </w:r>
     </w:p>
     <w:p>
       <w:pPr>
-        <w:pStyle w:val="Prrafodelista"/>
-      </w:pPr>
-    </w:p>
-    <w:p>
+        <w:pStyle w:val="Ttulo1"/>
+      </w:pPr>
       <w:r>
-        <w:rPr>
-          <w:rFonts w:eastAsiaTheme="majorEastAsia" w:cstheme="majorBidi"/>
-          <w:b/>
-          <w:color w:val="833C0B" w:themeColor="accent2" w:themeShade="80"/>
-          <w:sz w:val="32"/>
-          <w:szCs w:val="32"/>
-        </w:rPr>
         <w:t>{{DESARROLLO_CONCEPTOS}}</w:t>
       </w:r>
     </w:p>
@@ -1199,25 +1279,23 @@
       <w:pPr>
         <w:pStyle w:val="Ttulo1"/>
       </w:pPr>
-      <w:bookmarkStart w:id="6" w:name="_Toc228795137"/>
-      <w:bookmarkStart w:id="7" w:name="_Toc230601833"/>
       <w:r>
-        <w:t>FINALIZACIÓN DE PRESTACIÓN DE SERVICIO</w:t>
+        <w:t>{{</w:t>
       </w:r>
-      <w:bookmarkEnd w:id="6"/>
-      <w:bookmarkEnd w:id="7"/>
+      <w:r>
+        <w:t>TITULO_FINALIZACION_SERVICIO</w:t>
+      </w:r>
+      <w:r>
+        <w:t>}}</w:t>
+      </w:r>
     </w:p>
-    <w:p/>
     <w:p>
-      <w:r>
-        <w:t>“</w:t>
-      </w:r>
       <w:r>
         <w:rPr>
           <w:b/>
           <w:bCs/>
         </w:rPr>
-        <w:t>YUCASA S.A. DE C.V.</w:t>
+        <w:t>{{EMPRESA_RECIBE}}</w:t>
       </w:r>
       <w:r>
         <w:rPr>
@@ -1315,7 +1393,7 @@
                                 <w:b/>
                                 <w:bCs/>
                               </w:rPr>
-                              <w:t>WAVELENS S.A. DE C.V.</w:t>
+                              <w:t>{{EMPRESA_BRINDA}}</w:t>
                             </w:r>
                           </w:p>
                         </w:txbxContent>
@@ -1373,7 +1451,7 @@
                           <w:b/>
                           <w:bCs/>
                         </w:rPr>
-                        <w:t>WAVELENS S.A. DE C.V.</w:t>
+                        <w:t>{{EMPRESA_BRINDA}}</w:t>
                       </w:r>
                     </w:p>
                   </w:txbxContent>
@@ -1460,7 +1538,7 @@
                                 <w:b/>
                                 <w:bCs/>
                               </w:rPr>
-                              <w:t>YUCASA S.A. DE C.V.</w:t>
+                              <w:t>{{EMPRESA_RECIBE}}</w:t>
                             </w:r>
                           </w:p>
                         </w:txbxContent>
@@ -1520,7 +1598,7 @@
                           <w:b/>
                           <w:bCs/>
                         </w:rPr>
-                        <w:t>YUCASA S.A. DE C.V.</w:t>
+                        <w:t>{{EMPRESA_RECIBE}}</w:t>
                       </w:r>
                     </w:p>
                   </w:txbxContent>
@@ -1583,20 +1661,33 @@
     </w:p>
     <w:p>
       <w:pPr>
+        <w:pStyle w:val="Ttulo1"/>
         <w:rPr>
-          <w:rFonts w:ascii="Cambria" w:eastAsia="Cambria" w:hAnsi="Cambria" w:cs="Cambria"/>
-          <w:szCs w:val="24"/>
+          <w:rFonts w:eastAsia="Cambria"/>
           <w:lang w:eastAsia="es-MX"/>
         </w:rPr>
       </w:pPr>
       <w:r>
         <w:rPr>
-          <w:rFonts w:ascii="Cambria" w:eastAsia="Cambria" w:hAnsi="Cambria" w:cs="Cambria"/>
-          <w:noProof/>
-          <w:szCs w:val="24"/>
+          <w:rFonts w:eastAsia="Cambria"/>
           <w:lang w:eastAsia="es-MX"/>
         </w:rPr>
         <w:lastRenderedPageBreak/>
+        <w:t>{{</w:t>
+      </w:r>
+      <w:r>
+        <w:rPr>
+          <w:rFonts w:eastAsia="Cambria"/>
+          <w:lang w:eastAsia="es-MX"/>
+        </w:rPr>
+        <w:t>TITULO_REFERENCIAS</w:t>
+      </w:r>
+      <w:r>
+        <w:rPr>
+          <w:rFonts w:eastAsia="Cambria"/>
+          <w:noProof/>
+          <w:lang w:eastAsia="es-MX"/>
+        </w:rPr>
         <mc:AlternateContent>
           <mc:Choice Requires="wps">
             <w:drawing>
@@ -1658,9 +1749,8 @@
       </w:r>
       <w:r>
         <w:rPr>
-          <w:rFonts w:ascii="Cambria" w:eastAsia="Cambria" w:hAnsi="Cambria" w:cs="Cambria"/>
+          <w:rFonts w:eastAsia="Cambria"/>
           <w:noProof/>
-          <w:szCs w:val="24"/>
           <w:lang w:eastAsia="es-MX"/>
         </w:rPr>
         <mc:AlternateContent>
@@ -1718,20 +1808,12 @@
           </mc:Fallback>
         </mc:AlternateContent>
       </w:r>
-    </w:p>
-    <w:p>
-      <w:pPr>
-        <w:pStyle w:val="Ttulo1"/>
-      </w:pPr>
-      <w:bookmarkStart w:id="8" w:name="_Toc228795138"/>
-      <w:bookmarkStart w:id="9" w:name="_Toc230601834"/>
       <w:r>
-        <w:t>REFERENCIAS</w:t>
-      </w:r>
-      <w:bookmarkEnd w:id="8"/>
-      <w:bookmarkEnd w:id="9"/>
-      <w:r>
-        <w:t xml:space="preserve"> </w:t>
+        <w:rPr>
+          <w:rFonts w:eastAsia="Cambria"/>
+          <w:lang w:eastAsia="es-MX"/>
+        </w:rPr>
+        <w:t>}}</w:t>
       </w:r>
     </w:p>
     <w:p>
@@ -1767,13 +1849,9 @@
       <w:pPr>
         <w:pStyle w:val="Ttulo1"/>
       </w:pPr>
-      <w:bookmarkStart w:id="10" w:name="_Toc228795139"/>
-      <w:bookmarkStart w:id="11" w:name="_Toc230601835"/>
       <w:r>
-        <w:t>CONTROL DE PAGOS</w:t>
+        <w:t>{{TITULO_CONTROL_PAGOS}}</w:t>
       </w:r>
-      <w:bookmarkEnd w:id="10"/>
-      <w:bookmarkEnd w:id="11"/>
     </w:p>
     <w:p>
       <w:r>
@@ -1806,15 +1884,8 @@
       <w:pPr>
         <w:pStyle w:val="Ttulo1"/>
       </w:pPr>
-      <w:bookmarkStart w:id="12" w:name="_Toc228795140"/>
-      <w:bookmarkStart w:id="13" w:name="_Toc230601836"/>
       <w:r>
-        <w:t>FACTURAS</w:t>
-      </w:r>
-      <w:bookmarkEnd w:id="12"/>
-      <w:bookmarkEnd w:id="13"/>
-      <w:r>
-        <w:t xml:space="preserve"> </w:t>
+        <w:t>{{TITULO_FACTURAS}}</w:t>
       </w:r>
     </w:p>
     <w:p/>
@@ -13962,6 +14033,7 @@
   <w:style w:type="character" w:default="1" w:styleId="Fuentedeprrafopredeter">
     <w:name w:val="Default Paragraph Font"/>
     <w:uiPriority w:val="1"/>
+    <w:semiHidden/>
     <w:unhideWhenUsed/>
   </w:style>
   <w:style w:type="table" w:default="1" w:styleId="Tablanormal">
@@ -14481,6 +14553,36 @@
       <w:rFonts w:ascii="Times New Roman" w:eastAsia="Times New Roman" w:hAnsi="Times New Roman" w:cs="Times New Roman"/>
       <w:szCs w:val="24"/>
       <w:lang w:eastAsia="es-MX"/>
+    </w:rPr>
+  </w:style>
+  <w:style w:type="paragraph" w:styleId="HTMLconformatoprevio">
+    <w:name w:val="HTML Preformatted"/>
+    <w:basedOn w:val="Normal"/>
+    <w:link w:val="HTMLconformatoprevioCar"/>
+    <w:uiPriority w:val="99"/>
+    <w:semiHidden/>
+    <w:unhideWhenUsed/>
+    <w:rsid w:val="00105198"/>
+    <w:pPr>
+      <w:spacing w:after="0" w:line="240" w:lineRule="auto"/>
+    </w:pPr>
+    <w:rPr>
+      <w:rFonts w:ascii="Consolas" w:hAnsi="Consolas"/>
+      <w:sz w:val="20"/>
+      <w:szCs w:val="20"/>
+    </w:rPr>
+  </w:style>
+  <w:style w:type="character" w:customStyle="1" w:styleId="HTMLconformatoprevioCar">
+    <w:name w:val="HTML con formato previo Car"/>
+    <w:basedOn w:val="Fuentedeprrafopredeter"/>
+    <w:link w:val="HTMLconformatoprevio"/>
+    <w:uiPriority w:val="99"/>
+    <w:semiHidden/>
+    <w:rsid w:val="00105198"/>
+    <w:rPr>
+      <w:rFonts w:ascii="Consolas" w:hAnsi="Consolas"/>
+      <w:sz w:val="20"/>
+      <w:szCs w:val="20"/>
     </w:rPr>
   </w:style>
 </w:styles>

</xml_diff>

<commit_message>
Correccion de bugs de tipografia en los 7 archivos
</commit_message>
<xml_diff>
--- a/plantillas/plantilla10/5.ENTREGABLE.docx
+++ b/plantillas/plantilla10/5.ENTREGABLE.docx
@@ -1856,15 +1856,6 @@
     <w:p>
       <w:r>
         <w:t>{{CONTROL_PAGOS}}</w:t>
-      </w:r>
-    </w:p>
-    <w:p>
-      <w:r>
-        <w:t>{{TOTAL}}</w:t>
-      </w:r>
-      <w:r>
-        <w:br/>
-        <w:t>{{TOTAL_LETRA}}</w:t>
       </w:r>
     </w:p>
     <w:p/>

</xml_diff>